<commit_message>
Add more infos to the info pages
</commit_message>
<xml_diff>
--- a/Documents/Info pages/EMG-info.docx
+++ b/Documents/Info pages/EMG-info.docx
@@ -454,6 +454,241 @@
     </w:p>
     <w:p>
       <w:pPr>
+        <w:rPr>
+          <w:rFonts w:ascii="Calibri" w:hAnsi="Calibri" w:cs="Calibri"/>
+          <w:b/>
+          <w:bCs/>
+        </w:rPr>
+      </w:pPr>
+      <w:r>
+        <w:rPr>
+          <w:rFonts w:ascii="Calibri" w:hAnsi="Calibri" w:cs="Calibri"/>
+          <w:b/>
+          <w:bCs/>
+        </w:rPr>
+        <w:br w:type="page"/>
+      </w:r>
+    </w:p>
+    <w:p>
+      <w:pPr>
+        <w:spacing w:after="120" w:line="276" w:lineRule="auto"/>
+        <w:rPr>
+          <w:rFonts w:ascii="Calibri" w:hAnsi="Calibri" w:cs="Calibri"/>
+          <w:b/>
+          <w:bCs/>
+        </w:rPr>
+      </w:pPr>
+      <w:r>
+        <w:rPr>
+          <w:rFonts w:ascii="Calibri" w:hAnsi="Calibri" w:cs="Calibri"/>
+          <w:b/>
+          <w:bCs/>
+        </w:rPr>
+        <w:lastRenderedPageBreak/>
+        <w:t>How to set up this demo:</w:t>
+      </w:r>
+    </w:p>
+    <w:p>
+      <w:pPr>
+        <w:pStyle w:val="ListParagraph"/>
+        <w:numPr>
+          <w:ilvl w:val="0"/>
+          <w:numId w:val="5"/>
+        </w:numPr>
+        <w:spacing w:after="120" w:line="276" w:lineRule="auto"/>
+        <w:rPr>
+          <w:rFonts w:ascii="Calibri" w:hAnsi="Calibri" w:cs="Calibri"/>
+        </w:rPr>
+      </w:pPr>
+      <w:r>
+        <w:rPr>
+          <w:rFonts w:ascii="Calibri" w:hAnsi="Calibri" w:cs="Calibri"/>
+        </w:rPr>
+        <w:t xml:space="preserve">Plug the green AUX cable into the </w:t>
+      </w:r>
+      <w:proofErr w:type="spellStart"/>
+      <w:r>
+        <w:rPr>
+          <w:rFonts w:ascii="Calibri" w:hAnsi="Calibri" w:cs="Calibri"/>
+        </w:rPr>
+        <w:t>spikerbox</w:t>
+      </w:r>
+      <w:proofErr w:type="spellEnd"/>
+      <w:r>
+        <w:rPr>
+          <w:rFonts w:ascii="Calibri" w:hAnsi="Calibri" w:cs="Calibri"/>
+        </w:rPr>
+        <w:t>. Use the end that is labelled with “</w:t>
+      </w:r>
+      <w:proofErr w:type="spellStart"/>
+      <w:r>
+        <w:rPr>
+          <w:rFonts w:ascii="Calibri" w:hAnsi="Calibri" w:cs="Calibri"/>
+        </w:rPr>
+        <w:t>Spikerbox</w:t>
+      </w:r>
+      <w:proofErr w:type="spellEnd"/>
+      <w:r>
+        <w:rPr>
+          <w:rFonts w:ascii="Calibri" w:hAnsi="Calibri" w:cs="Calibri"/>
+        </w:rPr>
+        <w:t>”. The other end labelled “Smartphones” goes to the iPad</w:t>
+      </w:r>
+    </w:p>
+    <w:p>
+      <w:pPr>
+        <w:pStyle w:val="ListParagraph"/>
+        <w:numPr>
+          <w:ilvl w:val="0"/>
+          <w:numId w:val="5"/>
+        </w:numPr>
+        <w:spacing w:after="120" w:line="276" w:lineRule="auto"/>
+        <w:rPr>
+          <w:rFonts w:ascii="Calibri" w:hAnsi="Calibri" w:cs="Calibri"/>
+        </w:rPr>
+      </w:pPr>
+      <w:r>
+        <w:rPr>
+          <w:rFonts w:ascii="Calibri" w:hAnsi="Calibri" w:cs="Calibri"/>
+        </w:rPr>
+        <w:t>Plug the orange cable into Channel 1 and make sure the switch next to it is on “Ch1”</w:t>
+      </w:r>
+    </w:p>
+    <w:p>
+      <w:pPr>
+        <w:pStyle w:val="ListParagraph"/>
+        <w:numPr>
+          <w:ilvl w:val="0"/>
+          <w:numId w:val="5"/>
+        </w:numPr>
+        <w:spacing w:after="120" w:line="276" w:lineRule="auto"/>
+        <w:rPr>
+          <w:rFonts w:ascii="Calibri" w:hAnsi="Calibri" w:cs="Calibri"/>
+        </w:rPr>
+      </w:pPr>
+      <w:r>
+        <w:rPr>
+          <w:rFonts w:ascii="Calibri" w:hAnsi="Calibri" w:cs="Calibri"/>
+        </w:rPr>
+        <w:t xml:space="preserve">Turn the </w:t>
+      </w:r>
+      <w:proofErr w:type="spellStart"/>
+      <w:r>
+        <w:rPr>
+          <w:rFonts w:ascii="Calibri" w:hAnsi="Calibri" w:cs="Calibri"/>
+        </w:rPr>
+        <w:t>spikerbox</w:t>
+      </w:r>
+      <w:proofErr w:type="spellEnd"/>
+      <w:r>
+        <w:rPr>
+          <w:rFonts w:ascii="Calibri" w:hAnsi="Calibri" w:cs="Calibri"/>
+        </w:rPr>
+        <w:t xml:space="preserve"> on by rotating the volume wheel. You should here a “click” when its on. You don’t need to turn the volume up a lot, but it can be interesting to hear the sound of the muscles as well.</w:t>
+      </w:r>
+    </w:p>
+    <w:p>
+      <w:pPr>
+        <w:pStyle w:val="ListParagraph"/>
+        <w:numPr>
+          <w:ilvl w:val="0"/>
+          <w:numId w:val="5"/>
+        </w:numPr>
+        <w:spacing w:after="120" w:line="276" w:lineRule="auto"/>
+        <w:rPr>
+          <w:rFonts w:ascii="Calibri" w:hAnsi="Calibri" w:cs="Calibri"/>
+        </w:rPr>
+      </w:pPr>
+      <w:r>
+        <w:rPr>
+          <w:rFonts w:ascii="Calibri" w:hAnsi="Calibri" w:cs="Calibri"/>
+        </w:rPr>
+        <w:t>Place two electrodes on the biceps brachii muscle of the student, and one electrode on the elbow bone.</w:t>
+      </w:r>
+    </w:p>
+    <w:p>
+      <w:pPr>
+        <w:pStyle w:val="ListParagraph"/>
+        <w:numPr>
+          <w:ilvl w:val="0"/>
+          <w:numId w:val="5"/>
+        </w:numPr>
+        <w:spacing w:after="120" w:line="276" w:lineRule="auto"/>
+        <w:rPr>
+          <w:rFonts w:ascii="Calibri" w:hAnsi="Calibri" w:cs="Calibri"/>
+        </w:rPr>
+      </w:pPr>
+      <w:r>
+        <w:rPr>
+          <w:rFonts w:ascii="Calibri" w:hAnsi="Calibri" w:cs="Calibri"/>
+        </w:rPr>
+        <w:t>Connect the muscle electrodes with the red cables and the bone electrode with the black cable.</w:t>
+      </w:r>
+    </w:p>
+    <w:p>
+      <w:pPr>
+        <w:spacing w:after="120" w:line="276" w:lineRule="auto"/>
+        <w:rPr>
+          <w:rFonts w:ascii="Calibri" w:hAnsi="Calibri" w:cs="Calibri"/>
+        </w:rPr>
+      </w:pPr>
+      <w:r>
+        <w:rPr>
+          <w:rFonts w:ascii="Calibri" w:hAnsi="Calibri" w:cs="Calibri"/>
+          <w:noProof/>
+        </w:rPr>
+        <w:drawing>
+          <wp:inline distT="0" distB="0" distL="0" distR="0" wp14:anchorId="0A89F084" wp14:editId="70E07A7D">
+            <wp:extent cx="5724525" cy="3810000"/>
+            <wp:effectExtent l="0" t="0" r="0" b="0"/>
+            <wp:docPr id="1291230193" name="Picture 3"/>
+            <wp:cNvGraphicFramePr>
+              <a:graphicFrameLocks xmlns:a="http://schemas.openxmlformats.org/drawingml/2006/main" noChangeAspect="1"/>
+            </wp:cNvGraphicFramePr>
+            <a:graphic xmlns:a="http://schemas.openxmlformats.org/drawingml/2006/main">
+              <a:graphicData uri="http://schemas.openxmlformats.org/drawingml/2006/picture">
+                <pic:pic xmlns:pic="http://schemas.openxmlformats.org/drawingml/2006/picture">
+                  <pic:nvPicPr>
+                    <pic:cNvPr id="0" name="Picture 3"/>
+                    <pic:cNvPicPr>
+                      <a:picLocks noChangeAspect="1" noChangeArrowheads="1"/>
+                    </pic:cNvPicPr>
+                  </pic:nvPicPr>
+                  <pic:blipFill>
+                    <a:blip r:embed="rId7" cstate="print">
+                      <a:extLst>
+                        <a:ext uri="{28A0092B-C50C-407E-A947-70E740481C1C}">
+                          <a14:useLocalDpi xmlns:a14="http://schemas.microsoft.com/office/drawing/2010/main" val="0"/>
+                        </a:ext>
+                      </a:extLst>
+                    </a:blip>
+                    <a:srcRect/>
+                    <a:stretch>
+                      <a:fillRect/>
+                    </a:stretch>
+                  </pic:blipFill>
+                  <pic:spPr bwMode="auto">
+                    <a:xfrm>
+                      <a:off x="0" y="0"/>
+                      <a:ext cx="5724525" cy="3810000"/>
+                    </a:xfrm>
+                    <a:prstGeom prst="rect">
+                      <a:avLst/>
+                    </a:prstGeom>
+                    <a:noFill/>
+                    <a:ln>
+                      <a:noFill/>
+                    </a:ln>
+                  </pic:spPr>
+                </pic:pic>
+              </a:graphicData>
+            </a:graphic>
+          </wp:inline>
+        </w:drawing>
+      </w:r>
+    </w:p>
+    <w:p>
+      <w:pPr>
         <w:spacing w:after="0" w:line="276" w:lineRule="auto"/>
         <w:rPr>
           <w:rFonts w:ascii="Calibri" w:hAnsi="Calibri" w:cs="Calibri"/>
@@ -461,8 +696,8 @@
       </w:pPr>
     </w:p>
     <w:sectPr>
-      <w:headerReference w:type="default" r:id="rId7"/>
-      <w:footerReference w:type="default" r:id="rId8"/>
+      <w:headerReference w:type="default" r:id="rId8"/>
+      <w:footerReference w:type="default" r:id="rId9"/>
       <w:pgSz w:w="11906" w:h="16838"/>
       <w:pgMar w:top="1440" w:right="1440" w:bottom="1440" w:left="1440" w:header="708" w:footer="708" w:gutter="0"/>
       <w:cols w:space="708"/>
@@ -1224,6 +1459,119 @@
       </w:rPr>
     </w:lvl>
   </w:abstractNum>
+  <w:abstractNum w:abstractNumId="4" w15:restartNumberingAfterBreak="0">
+    <w:nsid w:val="530E0CB3"/>
+    <w:multiLevelType w:val="hybridMultilevel"/>
+    <w:tmpl w:val="B29C9702"/>
+    <w:lvl w:ilvl="0" w:tplc="14090001">
+      <w:start w:val="1"/>
+      <w:numFmt w:val="bullet"/>
+      <w:lvlText w:val=""/>
+      <w:lvlJc w:val="left"/>
+      <w:pPr>
+        <w:ind w:left="720" w:hanging="360"/>
+      </w:pPr>
+      <w:rPr>
+        <w:rFonts w:ascii="Symbol" w:hAnsi="Symbol" w:hint="default"/>
+      </w:rPr>
+    </w:lvl>
+    <w:lvl w:ilvl="1" w:tplc="14090003" w:tentative="1">
+      <w:start w:val="1"/>
+      <w:numFmt w:val="bullet"/>
+      <w:lvlText w:val="o"/>
+      <w:lvlJc w:val="left"/>
+      <w:pPr>
+        <w:ind w:left="1440" w:hanging="360"/>
+      </w:pPr>
+      <w:rPr>
+        <w:rFonts w:ascii="Courier New" w:hAnsi="Courier New" w:cs="Courier New" w:hint="default"/>
+      </w:rPr>
+    </w:lvl>
+    <w:lvl w:ilvl="2" w:tplc="14090005" w:tentative="1">
+      <w:start w:val="1"/>
+      <w:numFmt w:val="bullet"/>
+      <w:lvlText w:val=""/>
+      <w:lvlJc w:val="left"/>
+      <w:pPr>
+        <w:ind w:left="2160" w:hanging="360"/>
+      </w:pPr>
+      <w:rPr>
+        <w:rFonts w:ascii="Wingdings" w:hAnsi="Wingdings" w:hint="default"/>
+      </w:rPr>
+    </w:lvl>
+    <w:lvl w:ilvl="3" w:tplc="14090001" w:tentative="1">
+      <w:start w:val="1"/>
+      <w:numFmt w:val="bullet"/>
+      <w:lvlText w:val=""/>
+      <w:lvlJc w:val="left"/>
+      <w:pPr>
+        <w:ind w:left="2880" w:hanging="360"/>
+      </w:pPr>
+      <w:rPr>
+        <w:rFonts w:ascii="Symbol" w:hAnsi="Symbol" w:hint="default"/>
+      </w:rPr>
+    </w:lvl>
+    <w:lvl w:ilvl="4" w:tplc="14090003" w:tentative="1">
+      <w:start w:val="1"/>
+      <w:numFmt w:val="bullet"/>
+      <w:lvlText w:val="o"/>
+      <w:lvlJc w:val="left"/>
+      <w:pPr>
+        <w:ind w:left="3600" w:hanging="360"/>
+      </w:pPr>
+      <w:rPr>
+        <w:rFonts w:ascii="Courier New" w:hAnsi="Courier New" w:cs="Courier New" w:hint="default"/>
+      </w:rPr>
+    </w:lvl>
+    <w:lvl w:ilvl="5" w:tplc="14090005" w:tentative="1">
+      <w:start w:val="1"/>
+      <w:numFmt w:val="bullet"/>
+      <w:lvlText w:val=""/>
+      <w:lvlJc w:val="left"/>
+      <w:pPr>
+        <w:ind w:left="4320" w:hanging="360"/>
+      </w:pPr>
+      <w:rPr>
+        <w:rFonts w:ascii="Wingdings" w:hAnsi="Wingdings" w:hint="default"/>
+      </w:rPr>
+    </w:lvl>
+    <w:lvl w:ilvl="6" w:tplc="14090001" w:tentative="1">
+      <w:start w:val="1"/>
+      <w:numFmt w:val="bullet"/>
+      <w:lvlText w:val=""/>
+      <w:lvlJc w:val="left"/>
+      <w:pPr>
+        <w:ind w:left="5040" w:hanging="360"/>
+      </w:pPr>
+      <w:rPr>
+        <w:rFonts w:ascii="Symbol" w:hAnsi="Symbol" w:hint="default"/>
+      </w:rPr>
+    </w:lvl>
+    <w:lvl w:ilvl="7" w:tplc="14090003" w:tentative="1">
+      <w:start w:val="1"/>
+      <w:numFmt w:val="bullet"/>
+      <w:lvlText w:val="o"/>
+      <w:lvlJc w:val="left"/>
+      <w:pPr>
+        <w:ind w:left="5760" w:hanging="360"/>
+      </w:pPr>
+      <w:rPr>
+        <w:rFonts w:ascii="Courier New" w:hAnsi="Courier New" w:cs="Courier New" w:hint="default"/>
+      </w:rPr>
+    </w:lvl>
+    <w:lvl w:ilvl="8" w:tplc="14090005" w:tentative="1">
+      <w:start w:val="1"/>
+      <w:numFmt w:val="bullet"/>
+      <w:lvlText w:val=""/>
+      <w:lvlJc w:val="left"/>
+      <w:pPr>
+        <w:ind w:left="6480" w:hanging="360"/>
+      </w:pPr>
+      <w:rPr>
+        <w:rFonts w:ascii="Wingdings" w:hAnsi="Wingdings" w:hint="default"/>
+      </w:rPr>
+    </w:lvl>
+  </w:abstractNum>
   <w:num w:numId="1" w16cid:durableId="1658879397">
     <w:abstractNumId w:val="1"/>
   </w:num>
@@ -1235,6 +1583,9 @@
   </w:num>
   <w:num w:numId="4" w16cid:durableId="1405956212">
     <w:abstractNumId w:val="3"/>
+  </w:num>
+  <w:num w:numId="5" w16cid:durableId="2076588631">
+    <w:abstractNumId w:val="4"/>
   </w:num>
 </w:numbering>
 </file>
@@ -1842,6 +2193,7 @@
   <w:style w:type="character" w:default="1" w:styleId="DefaultParagraphFont">
     <w:name w:val="Default Paragraph Font"/>
     <w:uiPriority w:val="1"/>
+    <w:semiHidden/>
     <w:unhideWhenUsed/>
   </w:style>
   <w:style w:type="table" w:default="1" w:styleId="TableNormal">

</xml_diff>

<commit_message>
Update posters and documentation
</commit_message>
<xml_diff>
--- a/Documents/Info pages/EMG-info.docx
+++ b/Documents/Info pages/EMG-info.docx
@@ -312,7 +312,7 @@
     </w:p>
     <w:p>
       <w:pPr>
-        <w:spacing w:after="120" w:line="276" w:lineRule="auto"/>
+        <w:spacing w:before="240" w:after="120" w:line="276" w:lineRule="auto"/>
         <w:rPr>
           <w:rFonts w:ascii="Calibri" w:hAnsi="Calibri" w:cs="Calibri"/>
           <w:b/>
@@ -534,6 +534,12 @@
         </w:rPr>
         <w:t>”. The other end labelled “Smartphones” goes to the iPad</w:t>
       </w:r>
+      <w:r>
+        <w:rPr>
+          <w:rFonts w:ascii="Calibri" w:hAnsi="Calibri" w:cs="Calibri"/>
+        </w:rPr>
+        <w:t xml:space="preserve"> (with the USB-C adapter)</w:t>
+      </w:r>
     </w:p>
     <w:p>
       <w:pPr>
@@ -584,7 +590,21 @@
         <w:rPr>
           <w:rFonts w:ascii="Calibri" w:hAnsi="Calibri" w:cs="Calibri"/>
         </w:rPr>
-        <w:t xml:space="preserve"> on by rotating the volume wheel. You should here a “click” when its on. You don’t need to turn the volume up a lot, but it can be interesting to hear the sound of the muscles as well.</w:t>
+        <w:t xml:space="preserve"> on by rotating the volume wheel. You should here a “click” when its on. You don’t need to turn the volume up a lot, but it can be interesting to </w:t>
+      </w:r>
+      <w:proofErr w:type="gramStart"/>
+      <w:r>
+        <w:rPr>
+          <w:rFonts w:ascii="Calibri" w:hAnsi="Calibri" w:cs="Calibri"/>
+        </w:rPr>
+        <w:t>hear the sound of</w:t>
+      </w:r>
+      <w:proofErr w:type="gramEnd"/>
+      <w:r>
+        <w:rPr>
+          <w:rFonts w:ascii="Calibri" w:hAnsi="Calibri" w:cs="Calibri"/>
+        </w:rPr>
+        <w:t xml:space="preserve"> the muscles as well.</w:t>
       </w:r>
     </w:p>
     <w:p>
@@ -604,6 +624,12 @@
           <w:rFonts w:ascii="Calibri" w:hAnsi="Calibri" w:cs="Calibri"/>
         </w:rPr>
         <w:t>Place two electrodes on the biceps brachii muscle of the student, and one electrode on the elbow bone.</w:t>
+      </w:r>
+      <w:r>
+        <w:rPr>
+          <w:rFonts w:ascii="Calibri" w:hAnsi="Calibri" w:cs="Calibri"/>
+        </w:rPr>
+        <w:t xml:space="preserve"> The two electrodes on the muscles should be aligned with the muscle fibre orientation.</w:t>
       </w:r>
     </w:p>
     <w:p>

</xml_diff>